<commit_message>
remove all AI/Claude/Anthropic mentions from project
</commit_message>
<xml_diff>
--- a/docs/Free_Lector_Dokumentacija.docx
+++ b/docs/Free_Lector_Dokumentacija.docx
@@ -40,7 +40,7 @@
           <w:rFonts w:ascii="Cambria" w:hAnsi="Cambria"/>
           <w:sz w:val="28"/>
         </w:rPr>
-        <w:t>Rule-based pristup bez AI modela</w:t>
+        <w:t>Rule-based pristup</w:t>
       </w:r>
     </w:p>
     <w:p/>
@@ -158,7 +158,7 @@
     </w:p>
     <w:p>
       <w:r>
-        <w:t>Free Lector je alat za determinističku lektorsku proveru dokumenata koji radi isključivo u korisnikovom web pregledaču. Ne koristi veštačku inteligenciju, ne šalje podatke ni na jedan server, i ne zahteva instalaciju. Ceo proces parsiranja dokumenta, primene pravila i generisanja izveštaja odvija se lokalno, u jednom HTML fajlu sa pratećim JavaScript modulima.</w:t>
+        <w:t>Free Lector je alat za determinističku lektorsku proveru dokumenata koji radi isključivo u korisnikovom web pregledaču. Ne šalje podatke ni na jedan server, i ne zahteva instalaciju. Ceo proces parsiranja dokumenta, primene pravila i generisanja izveštaja odvija se lokalno, u jednom HTML fajlu sa pratećim JavaScript modulima.</w:t>
       </w:r>
     </w:p>
     <w:p>
@@ -197,7 +197,7 @@
         <w:pStyle w:val="ListNumber"/>
       </w:pPr>
       <w:r>
-        <w:t>Demonstrirati da se značajan deo lektorskih provera može automatizovati determinističkim pravilima bez potrebe za AI modelima ili cloud servisima.</w:t>
+        <w:t>Demonstrirati da se značajan deo lektorskih provera može automatizovati determinističkim pravilima bez potrebe za cloud servisima.</w:t>
       </w:r>
     </w:p>
     <w:p>
@@ -245,27 +245,12 @@
         <w:pStyle w:val="Heading2"/>
       </w:pPr>
       <w:r>
-        <w:t>3.1 Uloga AI alata u razvoju</w:t>
+        <w:t>3.1 Principi dizajna</w:t>
       </w:r>
     </w:p>
     <w:p>
       <w:r>
-        <w:t>Free Lector je razvijen u saradnji sa AI asistentom (Claude, Anthropic). Važno je razlikovati dve potpuno različite stvari:</w:t>
-      </w:r>
-    </w:p>
-    <w:p>
-      <w:r>
-        <w:t>Sam alat ne koristi AI. On je čisto rule-based: deterministička pravila, regex obrasci, parsiranje XML strukture. Isti ulaz uvek daje isti izlaz.</w:t>
-      </w:r>
-    </w:p>
-    <w:p>
-      <w:r>
-        <w:t>Razvoj alata je koristio AI asistenta kao programerski alat. AI je pisao kod, predlagao arhitekturu, generisao testove, i pomagao u debugging-u. Ovo je analogno korišćenju IDE-a sa intellisense-om ili Stack Overflow-a – alat za produktivnost developera, ne komponenta samog proizvoda.</w:t>
-      </w:r>
-    </w:p>
-    <w:p>
-      <w:r>
-        <w:t>Konkretno, AI asistent je korišćen za:</w:t>
+        <w:t>Free Lector je dizajniran oko sledećih principa:</w:t>
       </w:r>
     </w:p>
     <w:p>
@@ -273,7 +258,7 @@
         <w:pStyle w:val="ListBullet"/>
       </w:pPr>
       <w:r>
-        <w:t>Pisanje inicijalnog koda parsera i rule engine-a na osnovu specifikacija</w:t>
+        <w:t>Determinizam – isti ulaz uvek daje isti izlaz. Nema stohastičkih komponenti.</w:t>
       </w:r>
     </w:p>
     <w:p>
@@ -281,7 +266,7 @@
         <w:pStyle w:val="ListBullet"/>
       </w:pPr>
       <w:r>
-        <w:t>Implementaciju naprednog OOXML parsiranja (gridSpan, vMerge, tracked changes, nested tables)</w:t>
+        <w:t>Privatnost – nijedan bajt dokumenta ne napušta pregledač.</w:t>
       </w:r>
     </w:p>
     <w:p>
@@ -289,7 +274,7 @@
         <w:pStyle w:val="ListBullet"/>
       </w:pPr>
       <w:r>
-        <w:t>Dizajn evaluation framework-a (Wilson CI, Brier score, reliability bins)</w:t>
+        <w:t>Transparentnost – svako pravilo je čitljivo i razumljivo, korisnik tačno zna šta se proverava.</w:t>
       </w:r>
     </w:p>
     <w:p>
@@ -297,7 +282,7 @@
         <w:pStyle w:val="ListBullet"/>
       </w:pPr>
       <w:r>
-        <w:t>Property-based fuzz testiranje sa fast-check bibliotekom</w:t>
+        <w:t>Nula zavisnosti od servera – ceo alat radi offline nakon prvog učitavanja.</w:t>
       </w:r>
     </w:p>
     <w:p>
@@ -305,28 +290,7 @@
         <w:pStyle w:val="ListBullet"/>
       </w:pPr>
       <w:r>
-        <w:t>Debugging false positive-a na realnim dokumentima</w:t>
-      </w:r>
-    </w:p>
-    <w:p>
-      <w:pPr>
-        <w:pStyle w:val="ListBullet"/>
-      </w:pPr>
-      <w:r>
-        <w:t>Iterativno poboljšanje pravila kroz više rundi revizije</w:t>
-      </w:r>
-    </w:p>
-    <w:p>
-      <w:pPr>
-        <w:pStyle w:val="ListBullet"/>
-      </w:pPr>
-      <w:r>
-        <w:t>Generisanje ove dokumentacije</w:t>
-      </w:r>
-    </w:p>
-    <w:p>
-      <w:r>
-        <w:t>Sav generisani kod je pregledan, testiran i modifikovan od strane autora. AI asistent nema pristup korisničkim dokumentima niti učestvuje u radu alata nakon što je kod napisan.</w:t>
+        <w:t>Ponovljivost – rezultati su reproduktivni i verifikovani sa 149 automatskih testova.</w:t>
       </w:r>
     </w:p>
     <w:p>
@@ -1053,50 +1017,6 @@
           </w:tcPr>
           <w:p>
             <w:r>
-              <w:t>AI asistent</w:t>
-            </w:r>
-          </w:p>
-        </w:tc>
-        <w:tc>
-          <w:tcPr>
-            <w:tcW w:type="dxa" w:w="4252"/>
-          </w:tcPr>
-          <w:p>
-            <w:r>
-              <w:t>Claude (Anthropic) – za generisanje koda, debugging, testiranje</w:t>
-            </w:r>
-          </w:p>
-        </w:tc>
-      </w:tr>
-      <w:tr>
-        <w:tc>
-          <w:tcPr>
-            <w:tcW w:type="dxa" w:w="4252"/>
-          </w:tcPr>
-          <w:p>
-            <w:r>
-              <w:t>IDE/Editor</w:t>
-            </w:r>
-          </w:p>
-        </w:tc>
-        <w:tc>
-          <w:tcPr>
-            <w:tcW w:type="dxa" w:w="4252"/>
-          </w:tcPr>
-          <w:p>
-            <w:r>
-              <w:t>Kiro CLI – AI-powered terminal razvojno okruženje</w:t>
-            </w:r>
-          </w:p>
-        </w:tc>
-      </w:tr>
-      <w:tr>
-        <w:tc>
-          <w:tcPr>
-            <w:tcW w:type="dxa" w:w="4252"/>
-          </w:tcPr>
-          <w:p>
-            <w:r>
               <w:t>Verziona kontrola</w:t>
             </w:r>
           </w:p>
@@ -1248,7 +1168,7 @@
     <w:p/>
     <w:p>
       <w:r>
-        <w:t>Napomena o transparentnosti: Ovaj projekat je razvijen uz pomoć AI asistenta. To je eksplicitno dokumentovano jer verujemo da je transparentnost važna. AI je korišćen kao alat za produktivnost (slično korišćenju IDE autocomplete-a ili kopiranja koda sa StackOverflow-a), ne kao zamena za razumevanje koda. Sav kod je pregledan, testiran, i modifikovan od strane autora.</w:t>
+        <w:t>Sav kod je pregledan, testiran, i verifikovan sa 149 automatskih testova pre objavljivanja.</w:t>
       </w:r>
     </w:p>
     <w:p>
@@ -1277,7 +1197,7 @@
         <w:pStyle w:val="ListNumber"/>
       </w:pPr>
       <w:r>
-        <w:t>Ne proverava gramatiku – padežne greške, slaganje subjekta i predikata, red reči – to zahteva NLP ili AI model.</w:t>
+        <w:t>Ne proverava gramatiku – padežne greške, slaganje subjekta i predikata, red reči – to zahteva napredne lingvističke modele.</w:t>
       </w:r>
     </w:p>
     <w:p>
@@ -1343,7 +1263,7 @@
     </w:p>
     <w:p>
       <w:r>
-        <w:t>Free Lector demonstrira da je moguće napraviti koristan, besplatan alat za tehničku lektorsku proveru dokumenata bez AI modela i bez slanja podataka na server. Deterministički, rule-based pristup ima prednosti u transparentnosti (korisnik tačno zna šta se proverava), ponovljivosti (isti ulaz = isti izlaz), i privatnosti (ništa ne napušta pregledač).</w:t>
+        <w:t>Free Lector demonstrira da je moguće napraviti koristan, besplatan alat za tehničku lektorsku proveru dokumenata bez slanja podataka na server. Deterministički, rule-based pristup ima prednosti u transparentnosti (korisnik tačno zna šta se proverava), ponovljivosti (isti ulaz = isti izlaz), i privatnosti (ništa ne napušta pregledač).</w:t>
       </w:r>
     </w:p>
     <w:p>
@@ -1353,7 +1273,7 @@
     </w:p>
     <w:p>
       <w:r>
-        <w:t>Korišćenje AI asistenta u razvoju je transparentno dokumentovano. Sam alat ne sadrži AI komponentu – to su čista, deterministička pravila koja se mogu pregledati, razumeti, i modifikovati.</w:t>
+        <w:t>To su čista, deterministička pravila koja se mogu pregledati, razumeti, i modifikovati.</w:t>
       </w:r>
     </w:p>
     <w:p>

</xml_diff>

<commit_message>
remove all em-dash/en-dash from evaluation and docs
</commit_message>
<xml_diff>
--- a/docs/Free_Lector_Dokumentacija.docx
+++ b/docs/Free_Lector_Dokumentacija.docx
@@ -70,7 +70,7 @@
           <w:rFonts w:ascii="Cambria" w:hAnsi="Cambria"/>
           <w:sz w:val="24"/>
         </w:rPr>
-        <w:t>Verzija 1.0 – Avgust 2026</w:t>
+        <w:t>Verzija 1.0 - Avgust 2026</w:t>
       </w:r>
     </w:p>
     <w:p>
@@ -163,7 +163,7 @@
     </w:p>
     <w:p>
       <w:r>
-        <w:t>Alat je namenjen autorima akademskih radova, lektorima i urednicima koji žele brzu, ponovljivu proveru tehničkih artefakata u tekstu pre slanja na recenziju ili objavljivanje. Free Lector ne zamenjuje ljudskog lektora – on hvata ono što ljudsko oko lako previdi: duple razmake, neuparene zagrade, mešanje pisama, ravne navodnike, markdown ostatke iz konverzija, i slične sistematske greške.</w:t>
+        <w:t>Alat je namenjen autorima akademskih radova, lektorima i urednicima koji žele brzu, ponovljivu proveru tehničkih artefakata u tekstu pre slanja na recenziju ili objavljivanje. Free Lector ne zamenjuje ljudskog lektora - on hvata ono što ljudsko oko lako previdi: duple razmake, neuparene zagrade, mešanje pisama, ravne navodnike, markdown ostatke iz konverzija, i slične sistematske greške.</w:t>
       </w:r>
     </w:p>
     <w:p>
@@ -229,7 +229,7 @@
         <w:pStyle w:val="ListNumber"/>
       </w:pPr>
       <w:r>
-        <w:t>Održati privatnost korisnika – nijedan bajt dokumenta ne napušta pregledač.</w:t>
+        <w:t>Održati privatnost korisnika - nijedan bajt dokumenta ne napušta pregledač.</w:t>
       </w:r>
     </w:p>
     <w:p>
@@ -258,7 +258,7 @@
         <w:pStyle w:val="ListBullet"/>
       </w:pPr>
       <w:r>
-        <w:t>Determinizam – isti ulaz uvek daje isti izlaz. Nema stohastičkih komponenti.</w:t>
+        <w:t>Determinizam - isti ulaz uvek daje isti izlaz. Nema stohastičkih komponenti.</w:t>
       </w:r>
     </w:p>
     <w:p>
@@ -266,7 +266,7 @@
         <w:pStyle w:val="ListBullet"/>
       </w:pPr>
       <w:r>
-        <w:t>Privatnost – nijedan bajt dokumenta ne napušta pregledač.</w:t>
+        <w:t>Privatnost - nijedan bajt dokumenta ne napušta pregledač.</w:t>
       </w:r>
     </w:p>
     <w:p>
@@ -274,7 +274,7 @@
         <w:pStyle w:val="ListBullet"/>
       </w:pPr>
       <w:r>
-        <w:t>Transparentnost – svako pravilo je čitljivo i razumljivo, korisnik tačno zna šta se proverava.</w:t>
+        <w:t>Transparentnost - svako pravilo je čitljivo i razumljivo, korisnik tačno zna šta se proverava.</w:t>
       </w:r>
     </w:p>
     <w:p>
@@ -282,7 +282,7 @@
         <w:pStyle w:val="ListBullet"/>
       </w:pPr>
       <w:r>
-        <w:t>Nula zavisnosti od servera – ceo alat radi offline nakon prvog učitavanja.</w:t>
+        <w:t>Nula zavisnosti od servera - ceo alat radi offline nakon prvog učitavanja.</w:t>
       </w:r>
     </w:p>
     <w:p>
@@ -290,7 +290,7 @@
         <w:pStyle w:val="ListBullet"/>
       </w:pPr>
       <w:r>
-        <w:t>Ponovljivost – rezultati su reproduktivni i verifikovani sa 149 automatskih testova.</w:t>
+        <w:t>Ponovljivost - rezultati su reproduktivni i verifikovani sa 149 automatskih testova.</w:t>
       </w:r>
     </w:p>
     <w:p>
@@ -311,7 +311,7 @@
         <w:rPr>
           <w:b/>
         </w:rPr>
-        <w:t xml:space="preserve">Faza 1 – Osnovna funkcionalnost: </w:t>
+        <w:t xml:space="preserve">Faza 1 - Osnovna funkcionalnost: </w:t>
       </w:r>
       <w:r>
         <w:t>DOCX parsiranje, osnovne provere (razmaci, zagrade, navodnici, duple reči), HTML interfejs, Excel/Markdown/JSON izvoz.</w:t>
@@ -322,7 +322,7 @@
         <w:rPr>
           <w:b/>
         </w:rPr>
-        <w:t xml:space="preserve">Faza 2 – Napredno OOXML parsiranje: </w:t>
+        <w:t xml:space="preserve">Faza 2 - Napredno OOXML parsiranje: </w:t>
       </w:r>
       <w:r>
         <w:t>Podrška za gridSpan, vMerge, tracked changes, nested tables, numerisanje sa lvlOverride/lvlRestart, header/footer parsiranje.</w:t>
@@ -333,10 +333,10 @@
         <w:rPr>
           <w:b/>
         </w:rPr>
-        <w:t xml:space="preserve">Faza 3 – Fuzz testiranje: </w:t>
+        <w:t xml:space="preserve">Faza 3 - Fuzz testiranje: </w:t>
       </w:r>
       <w:r>
-        <w:t>Property-based testovi sa fast-check bibliotekom. 10 svojstava, 500–10000 slučajeva. Otkriveni i popravljeni edge case-ovi.</w:t>
+        <w:t>Property-based testovi sa fast-check bibliotekom. 10 svojstava, 500-10000 slučajeva. Otkriveni i popravljeni edge case-ovi.</w:t>
       </w:r>
     </w:p>
     <w:p>
@@ -344,7 +344,7 @@
         <w:rPr>
           <w:b/>
         </w:rPr>
-        <w:t xml:space="preserve">Faza 4 – Testiranje na realnim dokumentima: </w:t>
+        <w:t xml:space="preserve">Faza 4 - Testiranje na realnim dokumentima: </w:t>
       </w:r>
       <w:r>
         <w:t>Provera na akademskim radovima (doktorska disertacija, klasičnofilološke studije, istorijski radovi). Eliminacija false positive-a: bibliografija, TOC, naslovna strana.</w:t>
@@ -355,7 +355,7 @@
         <w:rPr>
           <w:b/>
         </w:rPr>
-        <w:t xml:space="preserve">Faza 5 – Preset sistem i evaluation: </w:t>
+        <w:t xml:space="preserve">Faza 5 - Preset sistem i evaluation: </w:t>
       </w:r>
       <w:r>
         <w:t>Basic/Full/Custom presets. Wilson score confidence intervali. Brier score. Cochran formula za veličinu uzorka. Stroga CSV validacija.</w:t>
@@ -379,7 +379,7 @@
         <w:pStyle w:val="ListNumber"/>
       </w:pPr>
       <w:r>
-        <w:t>Unit testovi (109 testova) – pokrivaju svaki rule, svaki edge case parsera, svaku kombinaciju opcija.</w:t>
+        <w:t>Unit testovi (109 testova) - pokrivaju svaki rule, svaki edge case parsera, svaku kombinaciju opcija.</w:t>
       </w:r>
     </w:p>
     <w:p>
@@ -387,7 +387,7 @@
         <w:pStyle w:val="ListNumber"/>
       </w:pPr>
       <w:r>
-        <w:t>Property-based fuzz testovi (10 svojstava, 500 slučajeva svako, 10000 za nightly) – generišu nasumične ulaze i proveravaju invarijante: nema crash-a, nema gubitka teksta, determinizam, konzistentnost ID-jeva.</w:t>
+        <w:t>Property-based fuzz testovi (10 svojstava, 500 slučajeva svako, 10000 za nightly) - generišu nasumične ulaze i proveravaju invarijante: nema crash-a, nema gubitka teksta, determinizam, konzistentnost ID-jeva.</w:t>
       </w:r>
     </w:p>
     <w:p>
@@ -395,7 +395,7 @@
         <w:pStyle w:val="ListNumber"/>
       </w:pPr>
       <w:r>
-        <w:t>Evaluation testovi (30 testova) – proveravaju CLI alate za evaluaciju: validaciju CSV-a, Wilson interval izračunavanje, sample size formulu, odbijanje nevalidnih ulaza.</w:t>
+        <w:t>Evaluation testovi (30 testova) - proveravaju CLI alate za evaluaciju: validaciju CSV-a, Wilson interval izračunavanje, sample size formulu, odbijanje nevalidnih ulaza.</w:t>
       </w:r>
     </w:p>
     <w:p>
@@ -466,7 +466,7 @@
         <w:pStyle w:val="ListBullet"/>
       </w:pPr>
       <w:r>
-        <w:t>Tracked changes – detektuje, ne primenjuje</w:t>
+        <w:t>Tracked changes - detektuje, ne primenjuje</w:t>
       </w:r>
     </w:p>
     <w:p>
@@ -508,7 +508,7 @@
     </w:p>
     <w:p>
       <w:r>
-        <w:t>Deterministički engine koji primenjuje pravila na parsiranu strukturu dokumenta. Svako pravilo je obična JavaScript funkcija koja prima docMap i vraća niz nalaza. Nema ML modela, nema heuristika koje se menjaju – isti ulaz uvek daje isti izlaz.</w:t>
+        <w:t>Deterministički engine koji primenjuje pravila na parsiranu strukturu dokumenta. Svako pravilo je obična JavaScript funkcija koja prima docMap i vraća niz nalaza. Nema ML modela, nema heuristika koje se menjaju - isti ulaz uvek daje isti izlaz.</w:t>
       </w:r>
     </w:p>
     <w:p>
@@ -521,7 +521,7 @@
         <w:pStyle w:val="ListBullet"/>
       </w:pPr>
       <w:r>
-        <w:t>rule_id – stabilan identifikator pravila (npr. spacing_body, brackets_header)</w:t>
+        <w:t>rule_id - stabilan identifikator pravila (npr. spacing_body, brackets_header)</w:t>
       </w:r>
     </w:p>
     <w:p>
@@ -529,7 +529,7 @@
         <w:pStyle w:val="ListBullet"/>
       </w:pPr>
       <w:r>
-        <w:t>category – kategorija greške (Razmaci, Zagrade, Tipografija...)</w:t>
+        <w:t>category - kategorija greške (Razmaci, Zagrade, Tipografija...)</w:t>
       </w:r>
     </w:p>
     <w:p>
@@ -537,7 +537,7 @@
         <w:pStyle w:val="ListBullet"/>
       </w:pPr>
       <w:r>
-        <w:t>priority – Obavezno, Blokirajuće, Proveriti, ili Preporuka</w:t>
+        <w:t>priority - Obavezno, Blokirajuće, Proveriti, ili Preporuka</w:t>
       </w:r>
     </w:p>
     <w:p>
@@ -545,7 +545,7 @@
         <w:pStyle w:val="ListBullet"/>
       </w:pPr>
       <w:r>
-        <w:t>confidence – heuristička procena pouzdanosti (0.0–1.0)</w:t>
+        <w:t>confidence - heuristička procena pouzdanosti (0.0-1.0)</w:t>
       </w:r>
     </w:p>
     <w:p>
@@ -553,7 +553,7 @@
         <w:pStyle w:val="ListBullet"/>
       </w:pPr>
       <w:r>
-        <w:t>original – originalni tekst sa greškom</w:t>
+        <w:t>original - originalni tekst sa greškom</w:t>
       </w:r>
     </w:p>
     <w:p>
@@ -561,7 +561,7 @@
         <w:pStyle w:val="ListBullet"/>
       </w:pPr>
       <w:r>
-        <w:t>replacement – predlog ispravke</w:t>
+        <w:t>replacement - predlog ispravke</w:t>
       </w:r>
     </w:p>
     <w:p>
@@ -569,7 +569,7 @@
         <w:pStyle w:val="ListBullet"/>
       </w:pPr>
       <w:r>
-        <w:t>rationale – obrazloženje zašto je ovo greška</w:t>
+        <w:t>rationale - obrazloženje zašto je ovo greška</w:t>
       </w:r>
     </w:p>
     <w:p>
@@ -577,7 +577,7 @@
         <w:pStyle w:val="ListBullet"/>
       </w:pPr>
       <w:r>
-        <w:t>section – lokacija u dokumentu</w:t>
+        <w:t>section - lokacija u dokumentu</w:t>
       </w:r>
     </w:p>
     <w:p>
@@ -606,7 +606,7 @@
         <w:t xml:space="preserve">Osnovna provera (Basic) </w:t>
       </w:r>
       <w:r>
-        <w:t>– samo visoko-pouzdane provere koje retko daju false positive: razmaci, zagrade, navodnici, mešanje pisama, duple reči, fusnote. Headers/footers su isključeni. Ovo je podrazumevani režim.</w:t>
+        <w:t>- samo visoko-pouzdane provere koje retko daju false positive: razmaci, zagrade, navodnici, mešanje pisama, duple reči, fusnote. Headers/footers su isključeni. Ovo je podrazumevani režim.</w:t>
       </w:r>
     </w:p>
     <w:p>
@@ -617,7 +617,7 @@
         <w:t xml:space="preserve">Puna provera (Full) </w:t>
       </w:r>
       <w:r>
-        <w:t>– sve provere uključene: bibliografija, TOC, numeracija, URL-ovi, grčki citati, markdown artefakti, ALL-CAPS, headers/footers. Može dati više false positive-a ali ništa ne propušta.</w:t>
+        <w:t>- sve provere uključene: bibliografija, TOC, numeracija, URL-ovi, grčki citati, markdown artefakti, ALL-CAPS, headers/footers. Može dati više false positive-a ali ništa ne propušta.</w:t>
       </w:r>
     </w:p>
     <w:p>
@@ -628,7 +628,7 @@
         <w:t xml:space="preserve">Prilagođeno (Custom) </w:t>
       </w:r>
       <w:r>
-        <w:t>– korisnik ručno bira koje provere želi. Automatski se aktivira kada korisnik promeni bilo koji checkbox iz Basic ili Full režima.</w:t>
+        <w:t>- korisnik ručno bira koje provere želi. Automatski se aktivira kada korisnik promeni bilo koji checkbox iz Basic ili Full režima.</w:t>
       </w:r>
     </w:p>
     <w:p>
@@ -649,7 +649,7 @@
         <w:pStyle w:val="ListBullet"/>
       </w:pPr>
       <w:r>
-        <w:t>Excel (.xlsx) – koristi SheetJS biblioteku. Sadrži sve nalaze sa kolonama: lokacija, kategorija, prioritet, original, predlog, obrazloženje, pouzdanost, rule_id, preset.</w:t>
+        <w:t>Excel (.xlsx) - koristi SheetJS biblioteku. Sadrži sve nalaze sa kolonama: lokacija, kategorija, prioritet, original, predlog, obrazloženje, pouzdanost, rule_id, preset.</w:t>
       </w:r>
     </w:p>
     <w:p>
@@ -657,7 +657,7 @@
         <w:pStyle w:val="ListBullet"/>
       </w:pPr>
       <w:r>
-        <w:t>Markdown (.md) – tabelarni format pogodan za pregled u bilo kom tekst editoru.</w:t>
+        <w:t>Markdown (.md) - tabelarni format pogodan za pregled u bilo kom tekst editoru.</w:t>
       </w:r>
     </w:p>
     <w:p>
@@ -665,7 +665,7 @@
         <w:pStyle w:val="ListBullet"/>
       </w:pPr>
       <w:r>
-        <w:t>JSON (.json) – mašinsko-čitljiv format za dalju obradu ili integraciju sa drugim alatima.</w:t>
+        <w:t>JSON (.json) - mašinsko-čitljiv format za dalju obradu ili integraciju sa drugim alatima.</w:t>
       </w:r>
     </w:p>
     <w:p>
@@ -922,7 +922,7 @@
     </w:p>
     <w:p>
       <w:r>
-        <w:t>Grupisanje nalaza po confidence opsezima (0.0–0.2, 0.2–0.4, ... 0.8–1.0) i poređenje srednje predikcije sa stvarnom tačnošću u svakom binu. Vizualizuje kalibracioni dijagram – koliko se predviđanja poklapaju sa stvarnošću.</w:t>
+        <w:t>Grupisanje nalaza po confidence opsezima (0.0-0.2, 0.2-0.4, ... 0.8-1.0) i poređenje srednje predikcije sa stvarnom tačnošću u svakom binu. Vizualizuje kalibracioni dijagram - koliko se predviđanja poklapaju sa stvarnošću.</w:t>
       </w:r>
     </w:p>
     <w:p>
@@ -1049,7 +1049,7 @@
           </w:tcPr>
           <w:p>
             <w:r>
-              <w:t>GitHub Pages – statičko hostovanje bez servera</w:t>
+              <w:t>GitHub Pages - statičko hostovanje bez servera</w:t>
             </w:r>
           </w:p>
         </w:tc>
@@ -1189,7 +1189,7 @@
         <w:pStyle w:val="ListNumber"/>
       </w:pPr>
       <w:r>
-        <w:t>Ne razume kontekst – ne može oceniti da li je rečenica logički ispravna, samo da li ima tehničke artefakte.</w:t>
+        <w:t>Ne razume kontekst - ne može oceniti da li je rečenica logički ispravna, samo da li ima tehničke artefakte.</w:t>
       </w:r>
     </w:p>
     <w:p>
@@ -1197,7 +1197,7 @@
         <w:pStyle w:val="ListNumber"/>
       </w:pPr>
       <w:r>
-        <w:t>Ne proverava gramatiku – padežne greške, slaganje subjekta i predikata, red reči – to zahteva napredne lingvističke modele.</w:t>
+        <w:t>Ne proverava gramatiku - padežne greške, slaganje subjekta i predikata, red reči - to zahteva napredne lingvističke modele.</w:t>
       </w:r>
     </w:p>
     <w:p>
@@ -1205,7 +1205,7 @@
         <w:pStyle w:val="ListNumber"/>
       </w:pPr>
       <w:r>
-        <w:t>Ne proverava stil – ne može reći da li je tekst preformalan, preopširan, ili neodgovarajuć za ciljnu publiku.</w:t>
+        <w:t>Ne proverava stil - ne može reći da li je tekst preformalan, preopširan, ili neodgovarajuć za ciljnu publiku.</w:t>
       </w:r>
     </w:p>
     <w:p>
@@ -1213,7 +1213,7 @@
         <w:pStyle w:val="ListNumber"/>
       </w:pPr>
       <w:r>
-        <w:t>Ne proverava sadržajnu tačnost – ne može verifikovati da li su podaci, datumi, ili reference tačni.</w:t>
+        <w:t>Ne proverava sadržajnu tačnost - ne može verifikovati da li su podaci, datumi, ili reference tačni.</w:t>
       </w:r>
     </w:p>
     <w:p>
@@ -1221,7 +1221,7 @@
         <w:pStyle w:val="ListNumber"/>
       </w:pPr>
       <w:r>
-        <w:t>Ne proverava prevode – ne može oceniti kvalitet prevoda grčkih ili latinskih citata.</w:t>
+        <w:t>Ne proverava prevode - ne može oceniti kvalitet prevoda grčkih ili latinskih citata.</w:t>
       </w:r>
     </w:p>
     <w:p>
@@ -1229,7 +1229,7 @@
         <w:pStyle w:val="ListNumber"/>
       </w:pPr>
       <w:r>
-        <w:t>Može dati false positive za neuobičajene ali validne konstrukcije – zato svaki nalaz ima confidence procenu i prioritet.</w:t>
+        <w:t>Može dati false positive za neuobičajene ali validne konstrukcije - zato svaki nalaz ima confidence procenu i prioritet.</w:t>
       </w:r>
     </w:p>
     <w:p>
@@ -1245,7 +1245,7 @@
         <w:pStyle w:val="ListNumber"/>
       </w:pPr>
       <w:r>
-        <w:t>Nema OCR – ne može čitati skenirane dokumente.</w:t>
+        <w:t>Nema OCR - ne može čitati skenirane dokumente.</w:t>
       </w:r>
     </w:p>
     <w:p>

</xml_diff>

<commit_message>
add About page, remove author from docs, link in footer
</commit_message>
<xml_diff>
--- a/docs/Free_Lector_Dokumentacija.docx
+++ b/docs/Free_Lector_Dokumentacija.docx
@@ -71,18 +71,6 @@
           <w:sz w:val="24"/>
         </w:rPr>
         <w:t>Verzija 1.0 - Avgust 2026</w:t>
-      </w:r>
-    </w:p>
-    <w:p>
-      <w:pPr>
-        <w:jc w:val="center"/>
-      </w:pPr>
-      <w:r>
-        <w:rPr>
-          <w:rFonts w:ascii="Cambria" w:hAnsi="Cambria"/>
-          <w:sz w:val="24"/>
-        </w:rPr>
-        <w:t>Autor: Tomislav Fedek</w:t>
       </w:r>
     </w:p>
     <w:p>

</xml_diff>